<commit_message>
Align Basic Shapes and Technical Architecture PRDs with universal Transparent color option
- Basic Shape Annotation Tools PRD v1.3: Stroke Color and Fill Color
  swatches document the diagonal-line transparent indicator (2.6);
  fill_color description (2.2) and Rectangle selection rule (13.3)
  drop the "no fill" wording
- Technical Architecture PRD v1.2: fill_color description in Common
  Vector Properties (4.3) reworded
- Both carry a September 2026 cover date, a Last Updated line, and a
  changelog entry naming fill_enabled as an open question

Follows General UI PRD v1.6 (Section 11.1), adopted in 6573af9.

Co-Authored-By: Claude Fable 5.1 <noreply@anthropic.com>
Claude-Session: https://claude.ai/code/session_01MHnFhcbDv3vWQS4eWQneAV
</commit_message>
<xml_diff>
--- a/PRDs/SnapMock-Basic-Shape-Annotation-Tools-PRD.docx
+++ b/PRDs/SnapMock-Basic-Shape-Annotation-Tools-PRD.docx
@@ -95,7 +95,7 @@
           <w:sz w:val="24"/>
           <w:szCs w:val="24"/>
         </w:rPr>
-        <w:t xml:space="preserve">Version 1.2</w:t>
+        <w:t>Version 1.3</w:t>
       </w:r>
     </w:p>
     <w:p>
@@ -108,7 +108,20 @@
           <w:sz w:val="24"/>
           <w:szCs w:val="24"/>
         </w:rPr>
-        <w:t xml:space="preserve">February 2026</w:t>
+        <w:t>September 2026</w:t>
+      </w:r>
+    </w:p>
+    <w:p>
+      <w:pPr>
+        <w:jc w:val="center"/>
+      </w:pPr>
+      <w:r>
+        <w:rPr>
+          <w:color w:val="888888"/>
+          <w:sz w:val="24"/>
+          <w:szCs w:val="24"/>
+        </w:rPr>
+        <w:t>Last Updated: 09-07-26 12:01</w:t>
       </w:r>
     </w:p>
     <w:p>
@@ -1824,7 +1837,7 @@
                 <w:sz w:val="20"/>
                 <w:szCs w:val="20"/>
               </w:rPr>
-              <w:t xml:space="preserve">Interior fill color. Transparent = no fill.</w:t>
+              <w:t>Interior fill color. Transparent is selected in the color picker like any other color (General UI PRD Section 11.1).</w:t>
             </w:r>
           </w:p>
         </w:tc>
@@ -3407,7 +3420,7 @@
         <w:spacing w:after="60"/>
       </w:pPr>
       <w:r>
-        <w:t xml:space="preserve">Stroke Color swatch button (24x24). Click for color picker popover.</w:t>
+        <w:t>Stroke Color swatch button (24x24). A small diagonal line through the swatch indicates the color is set to transparent. Click for color picker popover.</w:t>
       </w:r>
     </w:p>
     <w:p>
@@ -3420,7 +3433,7 @@
         <w:spacing w:after="60"/>
       </w:pPr>
       <w:r>
-        <w:t xml:space="preserve">Fill Color swatch button (24x24). Shows diagonal line for "no fill." Click for color picker popover.</w:t>
+        <w:t>Fill Color swatch button (24x24). A small diagonal line through the swatch indicates the color is set to transparent. Click for color picker popover.</w:t>
       </w:r>
     </w:p>
     <w:p>
@@ -21390,7 +21403,7 @@
         <w:spacing w:after="60"/>
       </w:pPr>
       <w:r>
-        <w:t xml:space="preserve">Empty (no fill) rectangles can only be selected by clicking near the border.</w:t>
+        <w:t>Rectangles whose fill color is transparent can only be selected by clicking near the border.</w:t>
       </w:r>
     </w:p>
     <w:p>
@@ -22008,6 +22021,70 @@
       </w:pPr>
       <w:r>
         <w:t xml:space="preserve">Changelog</w:t>
+      </w:r>
+    </w:p>
+    <w:p>
+      <w:pPr>
+        <w:spacing w:after="120"/>
+      </w:pPr>
+      <w:r>
+        <w:rPr>
+          <w:b/>
+          <w:bCs/>
+        </w:rPr>
+        <w:t>Version 1.3 (September 2026)</w:t>
+      </w:r>
+    </w:p>
+    <w:p>
+      <w:pPr>
+        <w:pStyle w:val="ListParagraph"/>
+        <w:numPr>
+          <w:ilvl w:val="0"/>
+          <w:numId w:val="8"/>
+        </w:numPr>
+        <w:spacing w:after="60"/>
+      </w:pPr>
+      <w:r>
+        <w:t>Section 2.6: Stroke Color and Fill Color swatch descriptions now state that a diagonal line indicates the color is set to transparent, replacing the "no fill" wording. Transparent is selected in the color picker like any other color (General UI PRD v1.6, Section 11.1).</w:t>
+      </w:r>
+    </w:p>
+    <w:p>
+      <w:pPr>
+        <w:pStyle w:val="ListParagraph"/>
+        <w:numPr>
+          <w:ilvl w:val="0"/>
+          <w:numId w:val="8"/>
+        </w:numPr>
+        <w:spacing w:after="60"/>
+      </w:pPr>
+      <w:r>
+        <w:t>Section 2.2: fill_color description reworded to remove "Transparent = no fill".</w:t>
+      </w:r>
+    </w:p>
+    <w:p>
+      <w:pPr>
+        <w:pStyle w:val="ListParagraph"/>
+        <w:numPr>
+          <w:ilvl w:val="0"/>
+          <w:numId w:val="8"/>
+        </w:numPr>
+        <w:spacing w:after="60"/>
+      </w:pPr>
+      <w:r>
+        <w:t>Section 13.3: Rectangle selection rule reworded from "Empty (no fill) rectangles" to rectangles whose fill color is transparent.</w:t>
+      </w:r>
+    </w:p>
+    <w:p>
+      <w:pPr>
+        <w:pStyle w:val="ListParagraph"/>
+        <w:numPr>
+          <w:ilvl w:val="0"/>
+          <w:numId w:val="8"/>
+        </w:numPr>
+        <w:spacing w:after="60"/>
+      </w:pPr>
+      <w:r>
+        <w:t>Open question: with transparent available as a fill color, the fill_enabled property may be redundant. It is unchanged in this version.</w:t>
       </w:r>
     </w:p>
     <w:p>

</xml_diff>

<commit_message>
Remove fill_enabled: a shape has no fill exactly when fill_color is transparent
Decision recorded in Basic Shape Annotation Tools PRD v1.4 (.docx and
HTML) and Technical Architecture PRD v1.3. The property was never
implemented; VectorItem has carried fill_color alone since the start.

- Basic Shapes 2.2 / Technical Architecture 4.3: fill_enabled row removed
- Basic Shapes 5.5, 5.6, 6.6, 7.6, 8.7, 9.8, 9.9, 13.4: rendering and
  hit-testing rules key on fill_color alpha
- Open issue recorded: RectangleItem.shape() always returns the filled
  interior, so near-the-border selection for transparent fills is not
  yet implemented (pre-existing gap)

Co-Authored-By: Claude Fable 5.1 <noreply@anthropic.com>
Claude-Session: https://claude.ai/code/session_01MHnFhcbDv3vWQS4eWQneAV
</commit_message>
<xml_diff>
--- a/PRDs/SnapMock-Basic-Shape-Annotation-Tools-PRD.docx
+++ b/PRDs/SnapMock-Basic-Shape-Annotation-Tools-PRD.docx
@@ -95,7 +95,7 @@
           <w:sz w:val="24"/>
           <w:szCs w:val="24"/>
         </w:rPr>
-        <w:t>Version 1.3</w:t>
+        <w:t>Version 1.4</w:t>
       </w:r>
     </w:p>
     <w:p>
@@ -121,7 +121,7 @@
           <w:sz w:val="24"/>
           <w:szCs w:val="24"/>
         </w:rPr>
-        <w:t>Last Updated: 09-07-26 12:01</w:t>
+        <w:t>Last Updated: 09-07-26 19:19</w:t>
       </w:r>
     </w:p>
     <w:p>
@@ -1866,116 +1866,6 @@
                 <w:sz w:val="20"/>
                 <w:szCs w:val="20"/>
               </w:rPr>
-              <w:t xml:space="preserve">fill_enabled</w:t>
-            </w:r>
-          </w:p>
-        </w:tc>
-        <w:tc>
-          <w:tcPr>
-            <w:tcW w:type="dxa" w:w="1600"/>
-            <w:tcBorders>
-              <w:top w:val="single" w:color="CCCCCC" w:sz="1"/>
-              <w:left w:val="single" w:color="CCCCCC" w:sz="1"/>
-              <w:bottom w:val="single" w:color="CCCCCC" w:sz="1"/>
-              <w:right w:val="single" w:color="CCCCCC" w:sz="1"/>
-            </w:tcBorders>
-            <w:tcMar>
-              <w:top w:type="dxa" w:w="80"/>
-              <w:left w:type="dxa" w:w="120"/>
-              <w:bottom w:type="dxa" w:w="80"/>
-              <w:right w:type="dxa" w:w="120"/>
-            </w:tcMar>
-          </w:tcPr>
-          <w:p>
-            <w:r>
-              <w:rPr>
-                <w:rFonts w:ascii="Arial" w:cs="Arial" w:eastAsia="Arial" w:hAnsi="Arial"/>
-                <w:sz w:val="20"/>
-                <w:szCs w:val="20"/>
-              </w:rPr>
-              <w:t xml:space="preserve">bool</w:t>
-            </w:r>
-          </w:p>
-        </w:tc>
-        <w:tc>
-          <w:tcPr>
-            <w:tcW w:type="dxa" w:w="1800"/>
-            <w:tcBorders>
-              <w:top w:val="single" w:color="CCCCCC" w:sz="1"/>
-              <w:left w:val="single" w:color="CCCCCC" w:sz="1"/>
-              <w:bottom w:val="single" w:color="CCCCCC" w:sz="1"/>
-              <w:right w:val="single" w:color="CCCCCC" w:sz="1"/>
-            </w:tcBorders>
-            <w:tcMar>
-              <w:top w:type="dxa" w:w="80"/>
-              <w:left w:type="dxa" w:w="120"/>
-              <w:bottom w:type="dxa" w:w="80"/>
-              <w:right w:type="dxa" w:w="120"/>
-            </w:tcMar>
-          </w:tcPr>
-          <w:p>
-            <w:r>
-              <w:rPr>
-                <w:rFonts w:ascii="Arial" w:cs="Arial" w:eastAsia="Arial" w:hAnsi="Arial"/>
-                <w:sz w:val="20"/>
-                <w:szCs w:val="20"/>
-              </w:rPr>
-              <w:t xml:space="preserve">False</w:t>
-            </w:r>
-          </w:p>
-        </w:tc>
-        <w:tc>
-          <w:tcPr>
-            <w:tcW w:type="dxa" w:w="4160"/>
-            <w:tcBorders>
-              <w:top w:val="single" w:color="CCCCCC" w:sz="1"/>
-              <w:left w:val="single" w:color="CCCCCC" w:sz="1"/>
-              <w:bottom w:val="single" w:color="CCCCCC" w:sz="1"/>
-              <w:right w:val="single" w:color="CCCCCC" w:sz="1"/>
-            </w:tcBorders>
-            <w:tcMar>
-              <w:top w:type="dxa" w:w="80"/>
-              <w:left w:type="dxa" w:w="120"/>
-              <w:bottom w:type="dxa" w:w="80"/>
-              <w:right w:type="dxa" w:w="120"/>
-            </w:tcMar>
-          </w:tcPr>
-          <w:p>
-            <w:r>
-              <w:rPr>
-                <w:rFonts w:ascii="Arial" w:cs="Arial" w:eastAsia="Arial" w:hAnsi="Arial"/>
-                <w:sz w:val="20"/>
-                <w:szCs w:val="20"/>
-              </w:rPr>
-              <w:t xml:space="preserve">Whether the shape has a visible fill. When False, fill_color is ignored.</w:t>
-            </w:r>
-          </w:p>
-        </w:tc>
-      </w:tr>
-      <w:tr>
-        <w:tc>
-          <w:tcPr>
-            <w:tcW w:type="dxa" w:w="1800"/>
-            <w:tcBorders>
-              <w:top w:val="single" w:color="CCCCCC" w:sz="1"/>
-              <w:left w:val="single" w:color="CCCCCC" w:sz="1"/>
-              <w:bottom w:val="single" w:color="CCCCCC" w:sz="1"/>
-              <w:right w:val="single" w:color="CCCCCC" w:sz="1"/>
-            </w:tcBorders>
-            <w:tcMar>
-              <w:top w:type="dxa" w:w="80"/>
-              <w:left w:type="dxa" w:w="120"/>
-              <w:bottom w:type="dxa" w:w="80"/>
-              <w:right w:type="dxa" w:w="120"/>
-            </w:tcMar>
-          </w:tcPr>
-          <w:p>
-            <w:r>
-              <w:rPr>
-                <w:rFonts w:ascii="Arial" w:cs="Arial" w:eastAsia="Arial" w:hAnsi="Arial"/>
-                <w:sz w:val="20"/>
-                <w:szCs w:val="20"/>
-              </w:rPr>
               <w:t xml:space="preserve">fill_opacity</w:t>
             </w:r>
           </w:p>
@@ -8114,7 +8004,7 @@
         <w:spacing w:after="60"/>
       </w:pPr>
       <w:r>
-        <w:t xml:space="preserve">When fill_enabled is True and fill_color is semi-transparent, the fill renders behind the stroke correctly without overlap artifacts.</w:t>
+        <w:t>When fill_color is semi-transparent (alpha between 0 and 255), the fill renders behind the stroke correctly without overlap artifacts.</w:t>
       </w:r>
     </w:p>
     <w:p>
@@ -8135,7 +8025,7 @@
         <w:spacing w:after="60"/>
       </w:pPr>
       <w:r>
-        <w:t xml:space="preserve">If fill_enabled is True: the shape() returns the filled rectangle path (clicking anywhere inside selects it).</w:t>
+        <w:t>If fill_color has an alpha greater than zero: shape() returns the filled rectangle path (clicking anywhere inside selects it).</w:t>
       </w:r>
     </w:p>
     <w:p>
@@ -8148,7 +8038,7 @@
         <w:spacing w:after="60"/>
       </w:pPr>
       <w:r>
-        <w:t xml:space="preserve">If fill_enabled is False: the shape() returns a QPainterPathStroker result of the rectangle outline with stroke_width + 4px padding. Only clicking near the border selects it.</w:t>
+        <w:t>If fill_color is transparent (alpha of zero): shape() returns a QPainterPathStroker result of the rectangle outline with stroke_width + 4px padding. Only clicking near the border selects it.</w:t>
       </w:r>
     </w:p>
     <w:p>
@@ -9046,7 +8936,7 @@
         <w:spacing w:after="60"/>
       </w:pPr>
       <w:r>
-        <w:t xml:space="preserve">If fill_enabled is True: shape() returns a QPainterPath with addEllipse() for the full ellipse area.</w:t>
+        <w:t>If fill_color has an alpha greater than zero: shape() returns a QPainterPath with addEllipse() for the full ellipse area.</w:t>
       </w:r>
     </w:p>
     <w:p>
@@ -9059,7 +8949,7 @@
         <w:spacing w:after="60"/>
       </w:pPr>
       <w:r>
-        <w:t xml:space="preserve">If fill_enabled is False: shape() returns a QPainterPathStroker result of the ellipse outline with stroke_width + 4px padding.</w:t>
+        <w:t>If fill_color is transparent (alpha of zero): shape() returns a QPainterPathStroker result of the ellipse outline with stroke_width + 4px padding.</w:t>
       </w:r>
     </w:p>
     <w:p>
@@ -11060,7 +10950,7 @@
         <w:spacing w:after="60"/>
       </w:pPr>
       <w:r>
-        <w:t xml:space="preserve">If arc_type is Chord, a closing straight line is drawn from end_point back to start_point. If fill_enabled, the enclosed area is filled.</w:t>
+        <w:t>If arc_type is Chord, a closing straight line is drawn from end_point back to start_point. The enclosed area is filled with fill_color; a transparent fill_color renders no fill.</w:t>
       </w:r>
     </w:p>
     <w:p>
@@ -11073,7 +10963,7 @@
         <w:spacing w:after="60"/>
       </w:pPr>
       <w:r>
-        <w:t xml:space="preserve">If arc_type is Pie, lines are drawn from start_point and end_point to the virtual center of the ellipse that the arc belongs to. If fill_enabled, the pie slice area is filled.</w:t>
+        <w:t>If arc_type is Pie, lines are drawn from start_point and end_point to the virtual center of the ellipse that the arc belongs to. The pie slice area is filled with fill_color; a transparent fill_color renders no fill.</w:t>
       </w:r>
     </w:p>
     <w:p>
@@ -13188,7 +13078,7 @@
         <w:spacing w:after="60"/>
       </w:pPr>
       <w:r>
-        <w:t xml:space="preserve">Same logic as Rectangle: if fill_enabled, the shape is the filled polygon path. If not filled, the shape is a stroked version of the outline path with padding.</w:t>
+        <w:t>Same logic as Rectangle: if fill_color has an alpha greater than zero, the shape is the filled polygon path. If fill_color is transparent, the shape is a stroked version of the outline path with padding.</w:t>
       </w:r>
     </w:p>
     <w:p>
@@ -15745,7 +15635,7 @@
         <w:spacing w:after="60"/>
       </w:pPr>
       <w:r>
-        <w:t xml:space="preserve">If fill_enabled and is_closed: fill the closed path with fill_color.</w:t>
+        <w:t>If is_closed: fill the closed path with fill_color. A transparent fill_color renders no fill.</w:t>
       </w:r>
     </w:p>
     <w:p>
@@ -15792,7 +15682,7 @@
         <w:spacing w:after="60"/>
       </w:pPr>
       <w:r>
-        <w:t xml:space="preserve">If is_closed and fill_enabled: shape() returns the filled closed path (click anywhere inside to select).</w:t>
+        <w:t>If is_closed and fill_color has an alpha greater than zero: shape() returns the filled closed path (click anywhere inside to select).</w:t>
       </w:r>
     </w:p>
     <w:p>
@@ -21489,7 +21379,7 @@
         <w:spacing w:after="60"/>
       </w:pPr>
       <w:r>
-        <w:t xml:space="preserve">Hit testing respects fill_enabled for clickable area.</w:t>
+        <w:t>Hit testing uses whether fill_color is transparent to determine the clickable area.</w:t>
       </w:r>
     </w:p>
     <w:p>
@@ -22032,6 +21922,57 @@
           <w:b/>
           <w:bCs/>
         </w:rPr>
+        <w:t>Version 1.4 (September 2026)</w:t>
+      </w:r>
+    </w:p>
+    <w:p>
+      <w:pPr>
+        <w:pStyle w:val="ListParagraph"/>
+        <w:numPr>
+          <w:ilvl w:val="0"/>
+          <w:numId w:val="8"/>
+        </w:numPr>
+        <w:spacing w:after="60"/>
+      </w:pPr>
+      <w:r>
+        <w:t>Decision: a shape has no fill exactly when its fill_color is transparent. The fill_enabled property is removed from Shared Properties (Section 2.2). This matches the implementation, which has never carried fill_enabled.</w:t>
+      </w:r>
+    </w:p>
+    <w:p>
+      <w:pPr>
+        <w:pStyle w:val="ListParagraph"/>
+        <w:numPr>
+          <w:ilvl w:val="0"/>
+          <w:numId w:val="8"/>
+        </w:numPr>
+        <w:spacing w:after="60"/>
+      </w:pPr>
+      <w:r>
+        <w:t>Sections 5.5, 5.6, 6.6, 7.6, 8.7, 9.8, 9.9, and 13.4: rendering and hit-testing rules that referenced fill_enabled now key on fill_color alpha (greater than zero is filled; zero is transparent).</w:t>
+      </w:r>
+    </w:p>
+    <w:p>
+      <w:pPr>
+        <w:pStyle w:val="ListParagraph"/>
+        <w:numPr>
+          <w:ilvl w:val="0"/>
+          <w:numId w:val="8"/>
+        </w:numPr>
+        <w:spacing w:after="60"/>
+      </w:pPr>
+      <w:r>
+        <w:t>Open issue: the current RectangleItem.shape() always returns the filled interior, so the near-the-border selection rule for transparent fills (Section 5.6) is not yet implemented. This gap predates version 1.4.</w:t>
+      </w:r>
+    </w:p>
+    <w:p>
+      <w:pPr>
+        <w:spacing w:after="120"/>
+      </w:pPr>
+      <w:r>
+        <w:rPr>
+          <w:b/>
+          <w:bCs/>
+        </w:rPr>
         <w:t>Version 1.3 (September 2026)</w:t>
       </w:r>
     </w:p>
@@ -22084,7 +22025,7 @@
         <w:spacing w:after="60"/>
       </w:pPr>
       <w:r>
-        <w:t>Open question: with transparent available as a fill color, the fill_enabled property may be redundant. It is unchanged in this version.</w:t>
+        <w:t>Open question raised: with transparent available as a fill color, the fill_enabled property may be redundant. Resolved in version 1.4.</w:t>
       </w:r>
     </w:p>
     <w:p>

</xml_diff>